<commit_message>
update course selection doc
</commit_message>
<xml_diff>
--- a/resources/class19/course-selection.docx
+++ b/resources/class19/course-selection.docx
@@ -20,7 +20,22 @@
         <w:spacing w:after="0"/>
       </w:pPr>
       <w:r>
-        <w:t>Course Schedule for Spring Available: Wednesday, October 4</w:t>
+        <w:t xml:space="preserve">Course Schedule for </w:t>
+      </w:r>
+      <w:r>
+        <w:t>fall</w:t>
+      </w:r>
+      <w:r>
+        <w:t xml:space="preserve"> </w:t>
+      </w:r>
+      <w:r>
+        <w:t>a</w:t>
+      </w:r>
+      <w:r>
+        <w:t>vailable:</w:t>
+      </w:r>
+      <w:r>
+        <w:t xml:space="preserve"> ???</w:t>
       </w:r>
     </w:p>
     <w:p>
@@ -35,13 +50,22 @@
         <w:t xml:space="preserve">Course Selection Period: 9 am Mon, </w:t>
       </w:r>
       <w:r>
-        <w:t>Nov 3</w:t>
-      </w:r>
-      <w:r>
-        <w:t xml:space="preserve"> – 4 pm Wed, Nov </w:t>
-      </w:r>
-      <w:r>
-        <w:t>5</w:t>
+        <w:t>Mar</w:t>
+      </w:r>
+      <w:r>
+        <w:t xml:space="preserve"> </w:t>
+      </w:r>
+      <w:r>
+        <w:t>2</w:t>
+      </w:r>
+      <w:r>
+        <w:t>3</w:t>
+      </w:r>
+      <w:r>
+        <w:t xml:space="preserve"> – 4 pm Wed, </w:t>
+      </w:r>
+      <w:r>
+        <w:t>Mar 25</w:t>
       </w:r>
     </w:p>
     <w:p>
@@ -53,10 +77,16 @@
         <w:spacing w:after="0"/>
       </w:pPr>
       <w:r>
-        <w:t>Priority Major Declaration Deadline: Monday, October 2</w:t>
-      </w:r>
-      <w:r>
-        <w:t>7</w:t>
+        <w:t xml:space="preserve">Priority Major Declaration Deadline: </w:t>
+      </w:r>
+      <w:r>
+        <w:t xml:space="preserve">approx </w:t>
+      </w:r>
+      <w:r>
+        <w:t xml:space="preserve">Monday, </w:t>
+      </w:r>
+      <w:r>
+        <w:t>Mar 16</w:t>
       </w:r>
     </w:p>
     <w:p>
@@ -68,10 +98,10 @@
         <w:spacing w:after="0"/>
       </w:pPr>
       <w:r>
-        <w:t xml:space="preserve">Start Major Declaration Process by: Monday, October </w:t>
-      </w:r>
-      <w:r>
-        <w:t>20</w:t>
+        <w:t xml:space="preserve">Start Major Declaration Process by: Monday, </w:t>
+      </w:r>
+      <w:r>
+        <w:t>Mar 2</w:t>
       </w:r>
     </w:p>
     <w:p>
@@ -135,31 +165,11 @@
         <w:t xml:space="preserve"> (See </w:t>
       </w:r>
       <w:hyperlink r:id="rId6" w:history="1">
-        <w:proofErr w:type="spellStart"/>
         <w:r>
           <w:rPr>
             <w:rStyle w:val="Hyperlink"/>
           </w:rPr>
-          <w:t>pr</w:t>
-        </w:r>
-        <w:r>
-          <w:rPr>
-            <w:rStyle w:val="Hyperlink"/>
-          </w:rPr>
-          <w:t>i</w:t>
-        </w:r>
-        <w:r>
-          <w:rPr>
-            <w:rStyle w:val="Hyperlink"/>
-          </w:rPr>
-          <w:t>oities</w:t>
-        </w:r>
-        <w:proofErr w:type="spellEnd"/>
-        <w:r>
-          <w:rPr>
-            <w:rStyle w:val="Hyperlink"/>
-          </w:rPr>
-          <w:t xml:space="preserve"> page</w:t>
+          <w:t>prioities page</w:t>
         </w:r>
       </w:hyperlink>
       <w:r>
@@ -175,7 +185,13 @@
         <w:spacing w:after="0"/>
       </w:pPr>
       <w:r>
-        <w:t>Consider taking COMP190, MATH170, and MATH211.</w:t>
+        <w:t>Consider taking COMP190</w:t>
+      </w:r>
+      <w:r>
+        <w:t xml:space="preserve"> </w:t>
+      </w:r>
+      <w:r>
+        <w:t>and MATH211.</w:t>
       </w:r>
     </w:p>
     <w:p>
@@ -187,7 +203,10 @@
         <w:spacing w:after="0"/>
       </w:pPr>
       <w:r>
-        <w:t>Optionally, think about DATA180 if interested in data analytics.</w:t>
+        <w:t>Optionally, think about DATA180 if interested in data analytics</w:t>
+      </w:r>
+      <w:r>
+        <w:t>, MATH170 if interested in math.</w:t>
       </w:r>
     </w:p>
     <w:p>
@@ -279,10 +298,10 @@
         </w:numPr>
       </w:pPr>
       <w:r>
-        <w:t xml:space="preserve">The process takes about a week, so start by Monday, October </w:t>
-      </w:r>
-      <w:r>
-        <w:t>20</w:t>
+        <w:t xml:space="preserve">The process takes about a week, so start by Monday, </w:t>
+      </w:r>
+      <w:r>
+        <w:t>Mar 2 due to spring break</w:t>
       </w:r>
       <w:r>
         <w:t>.</w:t>
@@ -324,9 +343,6 @@
       <w:r>
         <w:t>MATH211 can be taken immediately after COMP130 or after MATH170</w:t>
       </w:r>
-      <w:r>
-        <w:t xml:space="preserve"> – it’s usually better to take MATH170 first</w:t>
-      </w:r>
     </w:p>
     <w:p>
       <w:pPr>
@@ -339,18 +355,10 @@
         <w:t>DATA180 is important for data analytics</w:t>
       </w:r>
       <w:r>
-        <w:t xml:space="preserve"> and useful for computer </w:t>
-      </w:r>
-      <w:proofErr w:type="gramStart"/>
-      <w:r>
-        <w:t>science,</w:t>
-      </w:r>
-      <w:r>
-        <w:t xml:space="preserve"> but</w:t>
-      </w:r>
-      <w:proofErr w:type="gramEnd"/>
-      <w:r>
-        <w:t xml:space="preserve"> doesn't count towards the computer science major.</w:t>
+        <w:t xml:space="preserve"> and useful for computer science,</w:t>
+      </w:r>
+      <w:r>
+        <w:t xml:space="preserve"> but doesn't count towards the computer science major.</w:t>
       </w:r>
       <w:r>
         <w:rPr>

</xml_diff>